<commit_message>
Promote accepted UADC canonical authorities
</commit_message>
<xml_diff>
--- a/Specifications/UADC_Common_Library_Program_Specification.docx
+++ b/Specifications/UADC_Common_Library_Program_Specification.docx
@@ -75,11 +75,9 @@
           <w:b/>
           <w:bCs/>
         </w:rPr>
-        <w:t>Date</w:t>
+        <w:t>Date: 2026-09-30</w:t>
       </w:r>
-      <w:r>
-        <w:t>: 2026-09-15</w:t>
-      </w:r>
+      <w:r/>
     </w:p>
     <w:p>
       <w:r>
@@ -5427,7 +5425,7 @@
     </w:p>
     <w:p>
       <w:r>
-        <w:t>The library SHALL support a one-based occurrence selector `[n]` encoded directly in `semantic_path` values supplied by a Flat CSV Semantic Path Table. No separate selector field is accepted. Internally, the library MAY parse the embedded qualifier into an occurrence index while retaining the corresponding occurrence-neutral HMD Semantic Path. Removing all selector conditions SHALL yield the HMD `semantic_path` to which the binding row corresponds. The embedded qualifier is binding information and does not modify the HMD Semantic Path or establish a new semantic identity.</w:t>
+        <w:t>The library SHALL parse Binding semantic_path values while retaining the corresponding occurrence-neutral HMD Semantic Path. It SHALL support one-based [n] occurrence selectors and the limited value-condition grammar defined by the UADC Transformation Table Specification. No separate selector field is required for Flat CSV Binding.</w:t>
       </w:r>
     </w:p>
     <w:p>
@@ -5446,7 +5444,7 @@
           <w:sz w:val="20"/>
           <w:szCs w:val="20"/>
         </w:rPr>
-        <w:t xml:space="preserve">`semantic_path` = $.Invoice.TaxSubtotal[2].Amount  → </w:t>
+        <w:t>Examples: $.Invoice.TaxSubtotal[2].Amount; and $.cor_AccountingEntries.cor_EntryHeader.cor_EntryDetail[cor_DebitCreditIndicator='D'].cor_DetailTax[cor_TaxAuthority='NTA' and cor_TaxTableCode='VAT'].cor_AmountofTaxes.</w:t>
       </w:r>
     </w:p>
     <w:p>
@@ -5465,7 +5463,7 @@
           <w:sz w:val="20"/>
           <w:szCs w:val="20"/>
         </w:rPr>
-        <w:t>HMD `semantic_path` = $.</w:t>
+        <w:t>Removing all selectors and predicates SHALL yield the occurrence-neutral HMD semantic_path. Predicate scope belongs to the Class segment on which it is written; predicates at different hierarchy levels SHALL remain separately scoped.</w:t>
       </w:r>
       <w:proofErr w:type="spellStart"/>
       <w:r>
@@ -5474,7 +5472,6 @@
           <w:sz w:val="20"/>
           <w:szCs w:val="20"/>
         </w:rPr>
-        <w:t>Invoice.TaxSubtotal.Amount</w:t>
       </w:r>
       <w:proofErr w:type="spellEnd"/>
       <w:r>
@@ -5483,7 +5480,30 @@
           <w:sz w:val="20"/>
           <w:szCs w:val="20"/>
         </w:rPr>
-        <w:t>; embedded occurrence index = 2</w:t>
+      </w:r>
+    </w:p>
+    <w:p>
+      <w:pPr/>
+      <w:r>
+        <w:t>Limited predicate grammar: equality to a quoted literal, property presence, and, or, not, and parentheses. Parentheses have highest precedence, followed by not, and, then or.</w:t>
+      </w:r>
+    </w:p>
+    <w:p>
+      <w:pPr/>
+      <w:r>
+        <w:t>The parser SHALL return both the canonical selector-neutral path and a predicate representation that retains each predicate's owning Class segment. It SHALL NOT flatten predicates from different hierarchy levels into one unscoped condition list.</w:t>
+      </w:r>
+    </w:p>
+    <w:p>
+      <w:pPr/>
+      <w:r>
+        <w:t>Only a pure conjunction of positive equality predicates implies deterministic selector facts. OR, NOT, and presence predicates are selection-only. Unsupported comparisons, arithmetic, arbitrary functions, regex functions, XPath axes, and cross-occurrence expressions SHALL fail closed until a later specification revision explicitly adds them.</w:t>
+      </w:r>
+    </w:p>
+    <w:p>
+      <w:pPr/>
+      <w:r>
+        <w:t>The common semantic-path service SHALL provide canonical predicate normalization so equivalent reordering of AND/OR terms does not create a false new selector identity.</w:t>
       </w:r>
     </w:p>
     <w:p>
@@ -11272,7 +11292,7 @@
         </w:numPr>
       </w:pPr>
       <w:r>
-        <w:t>The recommended src/uadc package is not yet present. Current src/syntax_binding.py contains UBL-specific HMD, selector, occurrence, Structured CSV, OIM metadata, validation, and reverse-XML logic in one module.</w:t>
+        <w:t>The recommended shared uadc package is not yet present. Current tools/binding/syntax_binding.py contains UBL-specific HMD, selector, occurrence, Structured CSV, OIM metadata, validation, and reverse-XML logic in one module.</w:t>
       </w:r>
     </w:p>
     <w:p>
@@ -11284,7 +11304,7 @@
         </w:numPr>
       </w:pPr>
       <w:r>
-        <w:t>Current src/semantic_binding.py is a Structured CSV-to-flat CSV/PSV view generator; it is not the bidirectional cross-HMD semantic_table.py described by this specification.</w:t>
+        <w:t>Current tools/binding/semantic_binding.py is the normative reversible 27-column HMD-to-HMD Structured CSV Semantic Binding runtime. A separately named semantic_table.py remains architectural terminology only and is not the current executable.</w:t>
       </w:r>
     </w:p>
     <w:p>
@@ -11990,7 +12010,7 @@
                 <w:sz w:val="20"/>
                 <w:szCs w:val="20"/>
               </w:rPr>
-              <w:t>The canonical PCA/EPSON Binding uses 16 columns in a fixed order. The former 17-column form is accepted as compatibility input. Semantic identity is the selector-qualified semantic_path; selectors are removed for HMD resolution. The Binding does not contain an id column.</w:t>
+              <w:t>The canonical PCA/EPSON Binding uses 16 columns in a fixed order. The former 17-column form is accepted as compatibility input. Binding-row identity uses the full selector-qualified semantic_path; HMD semantic identity remains the selector-neutral semantic_path used after selectors are removed for HMD resolution. The Binding does not contain an id column.</w:t>
             </w:r>
           </w:p>
         </w:tc>
@@ -12050,7 +12070,7 @@
                 <w:sz w:val="20"/>
                 <w:szCs w:val="20"/>
               </w:rPr>
-              <w:t>tools/uadc/flat_csv.py reads the 16-column CANONICAL_FIELDS and the 17-column LEGACY_17_FIELDS, validates the HMD semantic_path and sequence, definition tables, grouping, and tax and account mappings, and performs bidirectional conversion.</w:t>
+              <w:t>tools/binding/flat_csv.py reads the 16-column CANONICAL_FIELDS and the 17-column LEGACY_17_FIELDS, validates the HMD semantic_path and sequence, definition tables, grouping, and tax and account mappings, and performs bidirectional conversion.</w:t>
             </w:r>
           </w:p>
         </w:tc>
@@ -12642,6 +12662,28 @@
                 <w:szCs w:val="20"/>
               </w:rPr>
               <w:t>Aligned with the canonical 16-column Binding, definition tables, tax processing, compound journal entries, formal xBRL-CSV, the stable namespace, the AE/BT split, and known issues.</w:t>
+            </w:r>
+          </w:p>
+        </w:tc>
+      </w:tr>
+      <w:tr>
+        <w:tc>
+          <w:tcPr>
+            <w:tcW w:type="dxa" w:w="1947"/>
+          </w:tcPr>
+          <w:p>
+            <w:r>
+              <w:t>30 September 2026</w:t>
+            </w:r>
+          </w:p>
+        </w:tc>
+        <w:tc>
+          <w:tcPr>
+            <w:tcW w:type="dxa" w:w="7789"/>
+          </w:tcPr>
+          <w:p>
+            <w:r>
+              <w:t>Added the limited Boolean Semantic Path predicate grammar, hierarchical selector scope, deterministic selector-fact rule, and corrected current runtime locations.</w:t>
             </w:r>
           </w:p>
         </w:tc>

</xml_diff>